<commit_message>
Complete Module 3: Advanced UI, CRUD, and Real-time Search
- Implemented role-based restrictions for search, sorting, and filtering.
- Developed real-time search that preserves input focus and filter state.
- Added Admin-only Product CRUD with auto-incrementing ProductID.
- Implemented "one-window" editing policy via session management.
- Integrated image management: automatic resizing to 300x200 and old file cleanup.
- Enhanced notification UI with descriptive icons and headers.
- Enforced 3NF referential integrity (blocking deletion of products in orders).
- Updated documentation: Algorithms.pdf and Screenshots.docx.

Co-authored-by: virys1121 <118748162+virys1121@users.noreply.github.com>
</commit_message>
<xml_diff>
--- a/Screenshots.docx
+++ b/Screenshots.docx
@@ -80,6 +80,330 @@
                   </pic:nvPicPr>
                   <pic:blipFill>
                     <a:blip r:embed="rId10"/>
+                    <a:stretch>
+                      <a:fillRect/>
+                    </a:stretch>
+                  </pic:blipFill>
+                  <pic:spPr>
+                    <a:xfrm>
+                      <a:off x="0" y="0"/>
+                      <a:ext cx="5486400" cy="3086100"/>
+                    </a:xfrm>
+                    <a:prstGeom prst="rect"/>
+                  </pic:spPr>
+                </pic:pic>
+              </a:graphicData>
+            </a:graphic>
+          </wp:inline>
+        </w:drawing>
+      </w:r>
+    </w:p>
+    <w:p>
+      <w:pPr>
+        <w:pStyle w:val="Heading1"/>
+      </w:pPr>
+      <w:r>
+        <w:t>Модуль 3: Поиск, фильтрация и CRUD</w:t>
+      </w:r>
+    </w:p>
+    <w:p>
+      <w:pPr>
+        <w:pStyle w:val="Heading2"/>
+      </w:pPr>
+      <w:r>
+        <w:t>Список товаров (Админ)</w:t>
+      </w:r>
+    </w:p>
+    <w:p>
+      <w:r>
+        <w:drawing>
+          <wp:inline xmlns:a="http://schemas.openxmlformats.org/drawingml/2006/main" xmlns:pic="http://schemas.openxmlformats.org/drawingml/2006/picture">
+            <wp:extent cx="5486400" cy="3086100"/>
+            <wp:docPr id="3" name="Picture 3"/>
+            <wp:cNvGraphicFramePr>
+              <a:graphicFrameLocks noChangeAspect="1"/>
+            </wp:cNvGraphicFramePr>
+            <a:graphic>
+              <a:graphicData uri="http://schemas.openxmlformats.org/drawingml/2006/picture">
+                <pic:pic>
+                  <pic:nvPicPr>
+                    <pic:cNvPr id="0" name="admin_products.png"/>
+                    <pic:cNvPicPr/>
+                  </pic:nvPicPr>
+                  <pic:blipFill>
+                    <a:blip r:embed="rId11"/>
+                    <a:stretch>
+                      <a:fillRect/>
+                    </a:stretch>
+                  </pic:blipFill>
+                  <pic:spPr>
+                    <a:xfrm>
+                      <a:off x="0" y="0"/>
+                      <a:ext cx="5486400" cy="3086100"/>
+                    </a:xfrm>
+                    <a:prstGeom prst="rect"/>
+                  </pic:spPr>
+                </pic:pic>
+              </a:graphicData>
+            </a:graphic>
+          </wp:inline>
+        </w:drawing>
+      </w:r>
+    </w:p>
+    <w:p>
+      <w:pPr>
+        <w:pStyle w:val="Heading2"/>
+      </w:pPr>
+      <w:r>
+        <w:t>Форма добавления товара</w:t>
+      </w:r>
+    </w:p>
+    <w:p>
+      <w:r>
+        <w:drawing>
+          <wp:inline xmlns:a="http://schemas.openxmlformats.org/drawingml/2006/main" xmlns:pic="http://schemas.openxmlformats.org/drawingml/2006/picture">
+            <wp:extent cx="5486400" cy="3086100"/>
+            <wp:docPr id="4" name="Picture 4"/>
+            <wp:cNvGraphicFramePr>
+              <a:graphicFrameLocks noChangeAspect="1"/>
+            </wp:cNvGraphicFramePr>
+            <a:graphic>
+              <a:graphicData uri="http://schemas.openxmlformats.org/drawingml/2006/picture">
+                <pic:pic>
+                  <pic:nvPicPr>
+                    <pic:cNvPr id="0" name="add_product_form.png"/>
+                    <pic:cNvPicPr/>
+                  </pic:nvPicPr>
+                  <pic:blipFill>
+                    <a:blip r:embed="rId12"/>
+                    <a:stretch>
+                      <a:fillRect/>
+                    </a:stretch>
+                  </pic:blipFill>
+                  <pic:spPr>
+                    <a:xfrm>
+                      <a:off x="0" y="0"/>
+                      <a:ext cx="5486400" cy="3086100"/>
+                    </a:xfrm>
+                    <a:prstGeom prst="rect"/>
+                  </pic:spPr>
+                </pic:pic>
+              </a:graphicData>
+            </a:graphic>
+          </wp:inline>
+        </w:drawing>
+      </w:r>
+    </w:p>
+    <w:p>
+      <w:pPr>
+        <w:pStyle w:val="Heading2"/>
+      </w:pPr>
+      <w:r>
+        <w:t>Результат поиска</w:t>
+      </w:r>
+    </w:p>
+    <w:p>
+      <w:r>
+        <w:drawing>
+          <wp:inline xmlns:a="http://schemas.openxmlformats.org/drawingml/2006/main" xmlns:pic="http://schemas.openxmlformats.org/drawingml/2006/picture">
+            <wp:extent cx="5486400" cy="3086100"/>
+            <wp:docPr id="5" name="Picture 5"/>
+            <wp:cNvGraphicFramePr>
+              <a:graphicFrameLocks noChangeAspect="1"/>
+            </wp:cNvGraphicFramePr>
+            <a:graphic>
+              <a:graphicData uri="http://schemas.openxmlformats.org/drawingml/2006/picture">
+                <pic:pic>
+                  <pic:nvPicPr>
+                    <pic:cNvPr id="0" name="search_result.png"/>
+                    <pic:cNvPicPr/>
+                  </pic:nvPicPr>
+                  <pic:blipFill>
+                    <a:blip r:embed="rId13"/>
+                    <a:stretch>
+                      <a:fillRect/>
+                    </a:stretch>
+                  </pic:blipFill>
+                  <pic:spPr>
+                    <a:xfrm>
+                      <a:off x="0" y="0"/>
+                      <a:ext cx="5486400" cy="3086100"/>
+                    </a:xfrm>
+                    <a:prstGeom prst="rect"/>
+                  </pic:spPr>
+                </pic:pic>
+              </a:graphicData>
+            </a:graphic>
+          </wp:inline>
+        </w:drawing>
+      </w:r>
+    </w:p>
+    <w:p>
+      <w:pPr>
+        <w:pStyle w:val="Heading2"/>
+      </w:pPr>
+      <w:r>
+        <w:t>Форма редактирования товара</w:t>
+      </w:r>
+    </w:p>
+    <w:p>
+      <w:r>
+        <w:drawing>
+          <wp:inline xmlns:a="http://schemas.openxmlformats.org/drawingml/2006/main" xmlns:pic="http://schemas.openxmlformats.org/drawingml/2006/picture">
+            <wp:extent cx="5486400" cy="3086100"/>
+            <wp:docPr id="6" name="Picture 6"/>
+            <wp:cNvGraphicFramePr>
+              <a:graphicFrameLocks noChangeAspect="1"/>
+            </wp:cNvGraphicFramePr>
+            <a:graphic>
+              <a:graphicData uri="http://schemas.openxmlformats.org/drawingml/2006/picture">
+                <pic:pic>
+                  <pic:nvPicPr>
+                    <pic:cNvPr id="0" name="edit_product_form.png"/>
+                    <pic:cNvPicPr/>
+                  </pic:nvPicPr>
+                  <pic:blipFill>
+                    <a:blip r:embed="rId14"/>
+                    <a:stretch>
+                      <a:fillRect/>
+                    </a:stretch>
+                  </pic:blipFill>
+                  <pic:spPr>
+                    <a:xfrm>
+                      <a:off x="0" y="0"/>
+                      <a:ext cx="5486400" cy="3086100"/>
+                    </a:xfrm>
+                    <a:prstGeom prst="rect"/>
+                  </pic:spPr>
+                </pic:pic>
+              </a:graphicData>
+            </a:graphic>
+          </wp:inline>
+        </w:drawing>
+      </w:r>
+    </w:p>
+    <w:p>
+      <w:pPr>
+        <w:pStyle w:val="Heading1"/>
+      </w:pPr>
+      <w:r>
+        <w:t>Модуль 3: Финальная проверка (Доп. требования)</w:t>
+      </w:r>
+    </w:p>
+    <w:p>
+      <w:pPr>
+        <w:pStyle w:val="Heading2"/>
+      </w:pPr>
+      <w:r>
+        <w:t>Поиск (Админ)</w:t>
+      </w:r>
+    </w:p>
+    <w:p>
+      <w:r>
+        <w:drawing>
+          <wp:inline xmlns:a="http://schemas.openxmlformats.org/drawingml/2006/main" xmlns:pic="http://schemas.openxmlformats.org/drawingml/2006/picture">
+            <wp:extent cx="5486400" cy="3086100"/>
+            <wp:docPr id="7" name="Picture 7"/>
+            <wp:cNvGraphicFramePr>
+              <a:graphicFrameLocks noChangeAspect="1"/>
+            </wp:cNvGraphicFramePr>
+            <a:graphic>
+              <a:graphicData uri="http://schemas.openxmlformats.org/drawingml/2006/picture">
+                <pic:pic>
+                  <pic:nvPicPr>
+                    <pic:cNvPr id="0" name="final_search.png"/>
+                    <pic:cNvPicPr/>
+                  </pic:nvPicPr>
+                  <pic:blipFill>
+                    <a:blip r:embed="rId15"/>
+                    <a:stretch>
+                      <a:fillRect/>
+                    </a:stretch>
+                  </pic:blipFill>
+                  <pic:spPr>
+                    <a:xfrm>
+                      <a:off x="0" y="0"/>
+                      <a:ext cx="5486400" cy="3086100"/>
+                    </a:xfrm>
+                    <a:prstGeom prst="rect"/>
+                  </pic:spPr>
+                </pic:pic>
+              </a:graphicData>
+            </a:graphic>
+          </wp:inline>
+        </w:drawing>
+      </w:r>
+    </w:p>
+    <w:p>
+      <w:pPr>
+        <w:pStyle w:val="Heading2"/>
+      </w:pPr>
+      <w:r>
+        <w:t>Блокировка одновременного редактирования</w:t>
+      </w:r>
+    </w:p>
+    <w:p>
+      <w:r>
+        <w:drawing>
+          <wp:inline xmlns:a="http://schemas.openxmlformats.org/drawingml/2006/main" xmlns:pic="http://schemas.openxmlformats.org/drawingml/2006/picture">
+            <wp:extent cx="5486400" cy="3086100"/>
+            <wp:docPr id="8" name="Picture 8"/>
+            <wp:cNvGraphicFramePr>
+              <a:graphicFrameLocks noChangeAspect="1"/>
+            </wp:cNvGraphicFramePr>
+            <a:graphic>
+              <a:graphicData uri="http://schemas.openxmlformats.org/drawingml/2006/picture">
+                <pic:pic>
+                  <pic:nvPicPr>
+                    <pic:cNvPr id="0" name="final_edit_lock.png"/>
+                    <pic:cNvPicPr/>
+                  </pic:nvPicPr>
+                  <pic:blipFill>
+                    <a:blip r:embed="rId16"/>
+                    <a:stretch>
+                      <a:fillRect/>
+                    </a:stretch>
+                  </pic:blipFill>
+                  <pic:spPr>
+                    <a:xfrm>
+                      <a:off x="0" y="0"/>
+                      <a:ext cx="5486400" cy="3086100"/>
+                    </a:xfrm>
+                    <a:prstGeom prst="rect"/>
+                  </pic:spPr>
+                </pic:pic>
+              </a:graphicData>
+            </a:graphic>
+          </wp:inline>
+        </w:drawing>
+      </w:r>
+    </w:p>
+    <w:p>
+      <w:pPr>
+        <w:pStyle w:val="Heading2"/>
+      </w:pPr>
+      <w:r>
+        <w:t>Вид для гостя (без фильтров и поиска)</w:t>
+      </w:r>
+    </w:p>
+    <w:p>
+      <w:r>
+        <w:drawing>
+          <wp:inline xmlns:a="http://schemas.openxmlformats.org/drawingml/2006/main" xmlns:pic="http://schemas.openxmlformats.org/drawingml/2006/picture">
+            <wp:extent cx="5486400" cy="3086100"/>
+            <wp:docPr id="9" name="Picture 9"/>
+            <wp:cNvGraphicFramePr>
+              <a:graphicFrameLocks noChangeAspect="1"/>
+            </wp:cNvGraphicFramePr>
+            <a:graphic>
+              <a:graphicData uri="http://schemas.openxmlformats.org/drawingml/2006/picture">
+                <pic:pic>
+                  <pic:nvPicPr>
+                    <pic:cNvPr id="0" name="final_guest_view.png"/>
+                    <pic:cNvPicPr/>
+                  </pic:nvPicPr>
+                  <pic:blipFill>
+                    <a:blip r:embed="rId17"/>
                     <a:stretch>
                       <a:fillRect/>
                     </a:stretch>

</xml_diff>